<commit_message>
Release 1.2.0: launch readiness
- single running copy; a second launch brings the first forward
- Help > Check for updates via GitHub Releases, optional weekly check
  (off by default)
- rotating log file and a crash dialog with copyable details
- licence notices for PySide6 (LGPL) and Python in the About box
- bundle QtNetwork in the Windows build for the single-instance lock
- docs: guide and briefing updated for 1.2, roadmap renumbered

Co-Authored-By: Claude Opus 5.5 <noreply@anthropic.com>
</commit_message>
<xml_diff>
--- a/docs/briefing.docx
+++ b/docs/briefing.docx
@@ -46,7 +46,7 @@
           <w:sz w:val="22"/>
           <w:szCs w:val="22"/>
         </w:rPr>
-        <w:t xml:space="preserve">Desktop Organizer 1.1.0 is built, tested and packaged for Windows, but not yet published or sold. It sorts files in the Desktop, Downloads, Documents or any chosen folder into a folder structure the user picks, and every run can be undone.</w:t>
+        <w:t xml:space="preserve">Desktop Organizer 1.2.0 is built, tested and packaged for Windows, but not yet published or sold. It sorts files in the Desktop, Downloads, Documents or any chosen folder into a folder structure the user picks, and every run can be undone.</w:t>
       </w:r>
     </w:p>
     <w:p>
@@ -75,7 +75,7 @@
           <w:sz w:val="22"/>
           <w:szCs w:val="22"/>
         </w:rPr>
-        <w:t xml:space="preserve"> a Windows app with an installer and portable zip, 93 automated tests, and two tagged releases (1.0.0 and 1.1.0, both on 5 October 2026).</w:t>
+        <w:t xml:space="preserve"> a Windows app with an installer and portable zip, 106 automated tests, and three tagged releases (1.0.0, 1.1.0 and 1.2.0, all on 5 October 2026).</w:t>
       </w:r>
     </w:p>
     <w:p>
@@ -133,7 +133,7 @@
           <w:sz w:val="22"/>
           <w:szCs w:val="22"/>
         </w:rPr>
-        <w:t xml:space="preserve"> licensing and payments, auto-update, and code signing so Windows stops warning about the installer.</w:t>
+        <w:t xml:space="preserve"> licensing and payments, publishing the first release on GitHub, and code signing so Windows stops warning about the installer.</w:t>
       </w:r>
     </w:p>
     <w:p>
@@ -155,7 +155,7 @@
           <w:sz w:val="22"/>
           <w:szCs w:val="22"/>
         </w:rPr>
-        <w:t xml:space="preserve">The app grew from a 107-line script into a full desktop app in two releases. Every feature below is working and free today.</w:t>
+        <w:t xml:space="preserve">The app grew from a 107-line script into a full desktop app in three releases. Every feature below is working and free today.</w:t>
       </w:r>
     </w:p>
     <w:tbl>
@@ -1401,6 +1401,309 @@
           </w:p>
         </w:tc>
       </w:tr>
+      <w:tr>
+        <w:trPr>
+          <w:cantSplit/>
+        </w:trPr>
+        <w:tc>
+          <w:tcPr>
+            <w:tcW w:type="dxa" w:w="2059"/>
+            <w:tcBorders>
+              <w:top w:val="single" w:color="D0D5DD" w:sz="4"/>
+              <w:left w:val="single" w:color="D0D5DD" w:sz="4"/>
+              <w:bottom w:val="single" w:color="D0D5DD" w:sz="4"/>
+              <w:right w:val="single" w:color="D0D5DD" w:sz="4"/>
+            </w:tcBorders>
+            <w:tcMar>
+              <w:top w:type="dxa" w:w="80"/>
+              <w:left w:type="dxa" w:w="120"/>
+              <w:bottom w:type="dxa" w:w="80"/>
+              <w:right w:type="dxa" w:w="120"/>
+            </w:tcMar>
+          </w:tcPr>
+          <w:p>
+            <w:pPr>
+              <w:keepNext w:val="false"/>
+            </w:pPr>
+            <w:r>
+              <w:rPr>
+                <w:rFonts w:ascii="Calibri" w:cs="Calibri" w:eastAsia="Calibri" w:hAnsi="Calibri"/>
+                <w:b w:val="false"/>
+                <w:bCs w:val="false"/>
+                <w:sz w:val="20"/>
+                <w:szCs w:val="20"/>
+              </w:rPr>
+              <w:t xml:space="preserve">One copy at a time</w:t>
+            </w:r>
+          </w:p>
+        </w:tc>
+        <w:tc>
+          <w:tcPr>
+            <w:tcW w:type="dxa" w:w="5897"/>
+            <w:tcBorders>
+              <w:top w:val="single" w:color="D0D5DD" w:sz="4"/>
+              <w:left w:val="single" w:color="D0D5DD" w:sz="4"/>
+              <w:bottom w:val="single" w:color="D0D5DD" w:sz="4"/>
+              <w:right w:val="single" w:color="D0D5DD" w:sz="4"/>
+            </w:tcBorders>
+            <w:tcMar>
+              <w:top w:type="dxa" w:w="80"/>
+              <w:left w:type="dxa" w:w="120"/>
+              <w:bottom w:type="dxa" w:w="80"/>
+              <w:right w:type="dxa" w:w="120"/>
+            </w:tcMar>
+          </w:tcPr>
+          <w:p>
+            <w:pPr>
+              <w:keepNext w:val="false"/>
+            </w:pPr>
+            <w:r>
+              <w:rPr>
+                <w:rFonts w:ascii="Calibri" w:cs="Calibri" w:eastAsia="Calibri" w:hAnsi="Calibri"/>
+                <w:b w:val="false"/>
+                <w:bCs w:val="false"/>
+                <w:sz w:val="20"/>
+                <w:szCs w:val="20"/>
+              </w:rPr>
+              <w:t xml:space="preserve">Opening the app again brings the running copy forward</w:t>
+            </w:r>
+          </w:p>
+        </w:tc>
+        <w:tc>
+          <w:tcPr>
+            <w:tcW w:type="dxa" w:w="1404"/>
+            <w:tcBorders>
+              <w:top w:val="single" w:color="D0D5DD" w:sz="4"/>
+              <w:left w:val="single" w:color="D0D5DD" w:sz="4"/>
+              <w:bottom w:val="single" w:color="D0D5DD" w:sz="4"/>
+              <w:right w:val="single" w:color="D0D5DD" w:sz="4"/>
+            </w:tcBorders>
+            <w:tcMar>
+              <w:top w:type="dxa" w:w="80"/>
+              <w:left w:type="dxa" w:w="120"/>
+              <w:bottom w:type="dxa" w:w="80"/>
+              <w:right w:type="dxa" w:w="120"/>
+            </w:tcMar>
+          </w:tcPr>
+          <w:p>
+            <w:pPr>
+              <w:keepNext w:val="false"/>
+            </w:pPr>
+            <w:r>
+              <w:rPr>
+                <w:rFonts w:ascii="Calibri" w:cs="Calibri" w:eastAsia="Calibri" w:hAnsi="Calibri"/>
+                <w:b w:val="false"/>
+                <w:bCs w:val="false"/>
+                <w:sz w:val="20"/>
+                <w:szCs w:val="20"/>
+              </w:rPr>
+              <w:t xml:space="preserve">1.2</w:t>
+            </w:r>
+          </w:p>
+        </w:tc>
+      </w:tr>
+      <w:tr>
+        <w:trPr>
+          <w:cantSplit/>
+        </w:trPr>
+        <w:tc>
+          <w:tcPr>
+            <w:tcW w:type="dxa" w:w="2059"/>
+            <w:tcBorders>
+              <w:top w:val="single" w:color="D0D5DD" w:sz="4"/>
+              <w:left w:val="single" w:color="D0D5DD" w:sz="4"/>
+              <w:bottom w:val="single" w:color="D0D5DD" w:sz="4"/>
+              <w:right w:val="single" w:color="D0D5DD" w:sz="4"/>
+            </w:tcBorders>
+            <w:tcMar>
+              <w:top w:type="dxa" w:w="80"/>
+              <w:left w:type="dxa" w:w="120"/>
+              <w:bottom w:type="dxa" w:w="80"/>
+              <w:right w:type="dxa" w:w="120"/>
+            </w:tcMar>
+          </w:tcPr>
+          <w:p>
+            <w:pPr>
+              <w:keepNext w:val="false"/>
+            </w:pPr>
+            <w:r>
+              <w:rPr>
+                <w:rFonts w:ascii="Calibri" w:cs="Calibri" w:eastAsia="Calibri" w:hAnsi="Calibri"/>
+                <w:b w:val="false"/>
+                <w:bCs w:val="false"/>
+                <w:sz w:val="20"/>
+                <w:szCs w:val="20"/>
+              </w:rPr>
+              <w:t xml:space="preserve">Updates</w:t>
+            </w:r>
+          </w:p>
+        </w:tc>
+        <w:tc>
+          <w:tcPr>
+            <w:tcW w:type="dxa" w:w="5897"/>
+            <w:tcBorders>
+              <w:top w:val="single" w:color="D0D5DD" w:sz="4"/>
+              <w:left w:val="single" w:color="D0D5DD" w:sz="4"/>
+              <w:bottom w:val="single" w:color="D0D5DD" w:sz="4"/>
+              <w:right w:val="single" w:color="D0D5DD" w:sz="4"/>
+            </w:tcBorders>
+            <w:tcMar>
+              <w:top w:type="dxa" w:w="80"/>
+              <w:left w:type="dxa" w:w="120"/>
+              <w:bottom w:type="dxa" w:w="80"/>
+              <w:right w:type="dxa" w:w="120"/>
+            </w:tcMar>
+          </w:tcPr>
+          <w:p>
+            <w:pPr>
+              <w:keepNext w:val="false"/>
+            </w:pPr>
+            <w:r>
+              <w:rPr>
+                <w:rFonts w:ascii="Calibri" w:cs="Calibri" w:eastAsia="Calibri" w:hAnsi="Calibri"/>
+                <w:b w:val="false"/>
+                <w:bCs w:val="false"/>
+                <w:sz w:val="20"/>
+                <w:szCs w:val="20"/>
+              </w:rPr>
+              <w:t xml:space="preserve">Check for updates from GitHub Releases; optional weekly check, off by default</w:t>
+            </w:r>
+          </w:p>
+        </w:tc>
+        <w:tc>
+          <w:tcPr>
+            <w:tcW w:type="dxa" w:w="1404"/>
+            <w:tcBorders>
+              <w:top w:val="single" w:color="D0D5DD" w:sz="4"/>
+              <w:left w:val="single" w:color="D0D5DD" w:sz="4"/>
+              <w:bottom w:val="single" w:color="D0D5DD" w:sz="4"/>
+              <w:right w:val="single" w:color="D0D5DD" w:sz="4"/>
+            </w:tcBorders>
+            <w:tcMar>
+              <w:top w:type="dxa" w:w="80"/>
+              <w:left w:type="dxa" w:w="120"/>
+              <w:bottom w:type="dxa" w:w="80"/>
+              <w:right w:type="dxa" w:w="120"/>
+            </w:tcMar>
+          </w:tcPr>
+          <w:p>
+            <w:pPr>
+              <w:keepNext w:val="false"/>
+            </w:pPr>
+            <w:r>
+              <w:rPr>
+                <w:rFonts w:ascii="Calibri" w:cs="Calibri" w:eastAsia="Calibri" w:hAnsi="Calibri"/>
+                <w:b w:val="false"/>
+                <w:bCs w:val="false"/>
+                <w:sz w:val="20"/>
+                <w:szCs w:val="20"/>
+              </w:rPr>
+              <w:t xml:space="preserve">1.2</w:t>
+            </w:r>
+          </w:p>
+        </w:tc>
+      </w:tr>
+      <w:tr>
+        <w:trPr>
+          <w:cantSplit/>
+        </w:trPr>
+        <w:tc>
+          <w:tcPr>
+            <w:tcW w:type="dxa" w:w="2059"/>
+            <w:tcBorders>
+              <w:top w:val="single" w:color="D0D5DD" w:sz="4"/>
+              <w:left w:val="single" w:color="D0D5DD" w:sz="4"/>
+              <w:bottom w:val="single" w:color="D0D5DD" w:sz="4"/>
+              <w:right w:val="single" w:color="D0D5DD" w:sz="4"/>
+            </w:tcBorders>
+            <w:tcMar>
+              <w:top w:type="dxa" w:w="80"/>
+              <w:left w:type="dxa" w:w="120"/>
+              <w:bottom w:type="dxa" w:w="80"/>
+              <w:right w:type="dxa" w:w="120"/>
+            </w:tcMar>
+          </w:tcPr>
+          <w:p>
+            <w:pPr>
+              <w:keepNext w:val="false"/>
+            </w:pPr>
+            <w:r>
+              <w:rPr>
+                <w:rFonts w:ascii="Calibri" w:cs="Calibri" w:eastAsia="Calibri" w:hAnsi="Calibri"/>
+                <w:b w:val="false"/>
+                <w:bCs w:val="false"/>
+                <w:sz w:val="20"/>
+                <w:szCs w:val="20"/>
+              </w:rPr>
+              <w:t xml:space="preserve">Error handling</w:t>
+            </w:r>
+          </w:p>
+        </w:tc>
+        <w:tc>
+          <w:tcPr>
+            <w:tcW w:type="dxa" w:w="5897"/>
+            <w:tcBorders>
+              <w:top w:val="single" w:color="D0D5DD" w:sz="4"/>
+              <w:left w:val="single" w:color="D0D5DD" w:sz="4"/>
+              <w:bottom w:val="single" w:color="D0D5DD" w:sz="4"/>
+              <w:right w:val="single" w:color="D0D5DD" w:sz="4"/>
+            </w:tcBorders>
+            <w:tcMar>
+              <w:top w:type="dxa" w:w="80"/>
+              <w:left w:type="dxa" w:w="120"/>
+              <w:bottom w:type="dxa" w:w="80"/>
+              <w:right w:type="dxa" w:w="120"/>
+            </w:tcMar>
+          </w:tcPr>
+          <w:p>
+            <w:pPr>
+              <w:keepNext w:val="false"/>
+            </w:pPr>
+            <w:r>
+              <w:rPr>
+                <w:rFonts w:ascii="Calibri" w:cs="Calibri" w:eastAsia="Calibri" w:hAnsi="Calibri"/>
+                <w:b w:val="false"/>
+                <w:bCs w:val="false"/>
+                <w:sz w:val="20"/>
+                <w:szCs w:val="20"/>
+              </w:rPr>
+              <w:t xml:space="preserve">Rotating log file; a friendly error dialog with details to copy</w:t>
+            </w:r>
+          </w:p>
+        </w:tc>
+        <w:tc>
+          <w:tcPr>
+            <w:tcW w:type="dxa" w:w="1404"/>
+            <w:tcBorders>
+              <w:top w:val="single" w:color="D0D5DD" w:sz="4"/>
+              <w:left w:val="single" w:color="D0D5DD" w:sz="4"/>
+              <w:bottom w:val="single" w:color="D0D5DD" w:sz="4"/>
+              <w:right w:val="single" w:color="D0D5DD" w:sz="4"/>
+            </w:tcBorders>
+            <w:tcMar>
+              <w:top w:type="dxa" w:w="80"/>
+              <w:left w:type="dxa" w:w="120"/>
+              <w:bottom w:type="dxa" w:w="80"/>
+              <w:right w:type="dxa" w:w="120"/>
+            </w:tcMar>
+          </w:tcPr>
+          <w:p>
+            <w:pPr>
+              <w:keepNext w:val="false"/>
+            </w:pPr>
+            <w:r>
+              <w:rPr>
+                <w:rFonts w:ascii="Calibri" w:cs="Calibri" w:eastAsia="Calibri" w:hAnsi="Calibri"/>
+                <w:b w:val="false"/>
+                <w:bCs w:val="false"/>
+                <w:sz w:val="20"/>
+                <w:szCs w:val="20"/>
+              </w:rPr>
+              <w:t xml:space="preserve">1.2</w:t>
+            </w:r>
+          </w:p>
+        </w:tc>
+      </w:tr>
     </w:tbl>
     <w:p>
       <w:pPr>
@@ -2130,7 +2433,7 @@
                 <w:sz w:val="20"/>
                 <w:szCs w:val="20"/>
               </w:rPr>
-              <w:t xml:space="preserve">93 automated tests, including headless tests of the window</w:t>
+              <w:t xml:space="preserve">106 automated tests, including headless tests of the window</w:t>
             </w:r>
           </w:p>
         </w:tc>
@@ -2218,7 +2521,7 @@
           <w:sz w:val="22"/>
           <w:szCs w:val="22"/>
         </w:rPr>
-        <w:t xml:space="preserve"> and </w:t>
+        <w:t xml:space="preserve">, </w:t>
       </w:r>
       <w:r>
         <w:rPr>
@@ -2235,6 +2538,23 @@
           <w:sz w:val="22"/>
           <w:szCs w:val="22"/>
         </w:rPr>
+        <w:t xml:space="preserve"> and </w:t>
+      </w:r>
+      <w:r>
+        <w:rPr>
+          <w:rFonts w:ascii="Consolas" w:cs="Consolas" w:eastAsia="Consolas" w:hAnsi="Consolas"/>
+          <w:sz w:val="19"/>
+          <w:szCs w:val="19"/>
+          <w:shd w:fill="F2F4F7" w:color="auto" w:val="clear"/>
+        </w:rPr>
+        <w:t xml:space="preserve">v1.2.0</w:t>
+      </w:r>
+      <w:r>
+        <w:rPr>
+          <w:rFonts w:ascii="Calibri" w:cs="Calibri" w:eastAsia="Calibri" w:hAnsi="Calibri"/>
+          <w:sz w:val="22"/>
+          <w:szCs w:val="22"/>
+        </w:rPr>
         <w:t xml:space="preserve">. It has not been pushed to GitHub or merged into </w:t>
       </w:r>
       <w:r>
@@ -2252,7 +2572,7 @@
           <w:sz w:val="22"/>
           <w:szCs w:val="22"/>
         </w:rPr>
-        <w:t xml:space="preserve">.</w:t>
+        <w:t xml:space="preserve">, and no GitHub release exists yet, so the update checker has nothing to offer until one is published.</w:t>
       </w:r>
     </w:p>
     <w:p>
@@ -5065,7 +5385,7 @@
           <w:sz w:val="22"/>
           <w:szCs w:val="22"/>
         </w:rPr>
-        <w:t xml:space="preserve">. Most of that already exists in 1.1; the rest is a short list of additions.</w:t>
+        <w:t xml:space="preserve">. Most of that already exists in 1.2; the rest is a short list of additions.</w:t>
       </w:r>
     </w:p>
     <w:tbl>
@@ -5476,7 +5796,7 @@
                 <w:sz w:val="20"/>
                 <w:szCs w:val="20"/>
               </w:rPr>
-              <w:t xml:space="preserve">Works offline with no account; Sortio sends file names to a cloud AI by default</w:t>
+              <w:t xml:space="preserve">Works offline with no account; the only network use is an update check the user turns on. Sortio sends file names to a cloud AI by default</w:t>
             </w:r>
           </w:p>
         </w:tc>
@@ -6067,7 +6387,7 @@
           <w:sz w:val="22"/>
           <w:szCs w:val="22"/>
         </w:rPr>
-        <w:t xml:space="preserve">Two releases are done; licensing (1.2) is next and waits on the pricing decisions below. No dates are set yet.</w:t>
+        <w:t xml:space="preserve">Three releases are done; licensing (1.3) is next and waits on the pricing decisions below. No dates are set yet.</w:t>
       </w:r>
     </w:p>
     <w:p>
@@ -6078,9 +6398,9 @@
       <w:r>
         <w:drawing>
           <wp:inline distT="0" distB="0" distL="0" distR="0">
-            <wp:extent cx="5943600" cy="4314825"/>
+            <wp:extent cx="5943600" cy="4943475"/>
             <wp:effectExtent t="0" r="0" b="0" l="0"/>
-            <wp:docPr id="2" name="roadmap" descr="Roadmap: 5 releases and 2 gates, not to scale" title="Roadmap: 5 releases and 2 gates, not to scale"/>
+            <wp:docPr id="2" name="roadmap" descr="Roadmap: 6 releases and 2 gates, not to scale" title="Roadmap: 6 releases and 2 gates, not to scale"/>
             <wp:cNvGraphicFramePr>
               <a:graphicFrameLocks xmlns:a="http://schemas.openxmlformats.org/drawingml/2006/main" noChangeAspect="1"/>
             </wp:cNvGraphicFramePr>
@@ -6103,7 +6423,7 @@
                   <pic:spPr bwMode="auto">
                     <a:xfrm>
                       <a:off x="0" y="0"/>
-                      <a:ext cx="5943600" cy="4314825"/>
+                      <a:ext cx="5943600" cy="4943475"/>
                     </a:xfrm>
                     <a:prstGeom prst="rect">
                       <a:avLst/>
@@ -6129,7 +6449,7 @@
           <w:sz w:val="18"/>
           <w:szCs w:val="18"/>
         </w:rPr>
-        <w:t xml:space="preserve">Roadmap: 5 releases and 2 gates, not to scale</w:t>
+        <w:t xml:space="preserve">Roadmap: 6 releases and 2 gates, not to scale</w:t>
       </w:r>
     </w:p>
     <w:p>
@@ -6277,7 +6597,7 @@
           </w:tcPr>
           <w:p>
             <w:pPr>
-              <w:keepNext/>
+              <w:keepNext w:val="false"/>
             </w:pPr>
             <w:r>
               <w:rPr>
@@ -6309,7 +6629,7 @@
           </w:tcPr>
           <w:p>
             <w:pPr>
-              <w:keepNext/>
+              <w:keepNext w:val="false"/>
             </w:pPr>
             <w:r>
               <w:rPr>
@@ -6346,7 +6666,7 @@
           </w:tcPr>
           <w:p>
             <w:pPr>
-              <w:keepNext/>
+              <w:keepNext w:val="false"/>
             </w:pPr>
             <w:r>
               <w:rPr>
@@ -6378,7 +6698,7 @@
           </w:tcPr>
           <w:p>
             <w:pPr>
-              <w:keepNext/>
+              <w:keepNext w:val="false"/>
             </w:pPr>
             <w:r>
               <w:rPr>
@@ -6415,7 +6735,7 @@
           </w:tcPr>
           <w:p>
             <w:pPr>
-              <w:keepNext/>
+              <w:keepNext w:val="false"/>
             </w:pPr>
             <w:r>
               <w:rPr>
@@ -6447,7 +6767,7 @@
           </w:tcPr>
           <w:p>
             <w:pPr>
-              <w:keepNext/>
+              <w:keepNext w:val="false"/>
             </w:pPr>
             <w:r>
               <w:rPr>
@@ -6484,7 +6804,7 @@
           </w:tcPr>
           <w:p>
             <w:pPr>
-              <w:keepNext/>
+              <w:keepNext w:val="false"/>
             </w:pPr>
             <w:r>
               <w:rPr>
@@ -6516,7 +6836,7 @@
           </w:tcPr>
           <w:p>
             <w:pPr>
-              <w:keepNext/>
+              <w:keepNext w:val="false"/>
             </w:pPr>
             <w:r>
               <w:rPr>
@@ -6553,7 +6873,76 @@
           </w:tcPr>
           <w:p>
             <w:pPr>
-              <w:keepNext/>
+              <w:keepNext w:val="false"/>
+            </w:pPr>
+            <w:r>
+              <w:rPr>
+                <w:rFonts w:ascii="Calibri" w:cs="Calibri" w:eastAsia="Calibri" w:hAnsi="Calibri"/>
+                <w:b w:val="false"/>
+                <w:bCs w:val="false"/>
+                <w:sz w:val="20"/>
+                <w:szCs w:val="20"/>
+              </w:rPr>
+              <w:t xml:space="preserve">Crashes nobody can diagnose</w:t>
+            </w:r>
+          </w:p>
+        </w:tc>
+        <w:tc>
+          <w:tcPr>
+            <w:tcW w:type="dxa" w:w="6365"/>
+            <w:tcBorders>
+              <w:top w:val="single" w:color="D0D5DD" w:sz="4"/>
+              <w:left w:val="single" w:color="D0D5DD" w:sz="4"/>
+              <w:bottom w:val="single" w:color="D0D5DD" w:sz="4"/>
+              <w:right w:val="single" w:color="D0D5DD" w:sz="4"/>
+            </w:tcBorders>
+            <w:tcMar>
+              <w:top w:type="dxa" w:w="80"/>
+              <w:left w:type="dxa" w:w="120"/>
+              <w:bottom w:type="dxa" w:w="80"/>
+              <w:right w:type="dxa" w:w="120"/>
+            </w:tcMar>
+          </w:tcPr>
+          <w:p>
+            <w:pPr>
+              <w:keepNext w:val="false"/>
+            </w:pPr>
+            <w:r>
+              <w:rPr>
+                <w:rFonts w:ascii="Calibri" w:cs="Calibri" w:eastAsia="Calibri" w:hAnsi="Calibri"/>
+                <w:b w:val="false"/>
+                <w:bCs w:val="false"/>
+                <w:sz w:val="20"/>
+                <w:szCs w:val="20"/>
+              </w:rPr>
+              <w:t xml:space="preserve">Errors go to a log file and a dialog with details users can copy into a report</w:t>
+            </w:r>
+          </w:p>
+        </w:tc>
+      </w:tr>
+      <w:tr>
+        <w:trPr>
+          <w:cantSplit/>
+        </w:trPr>
+        <w:tc>
+          <w:tcPr>
+            <w:tcW w:type="dxa" w:w="2995"/>
+            <w:tcBorders>
+              <w:top w:val="single" w:color="D0D5DD" w:sz="4"/>
+              <w:left w:val="single" w:color="D0D5DD" w:sz="4"/>
+              <w:bottom w:val="single" w:color="D0D5DD" w:sz="4"/>
+              <w:right w:val="single" w:color="D0D5DD" w:sz="4"/>
+            </w:tcBorders>
+            <w:tcMar>
+              <w:top w:type="dxa" w:w="80"/>
+              <w:left w:type="dxa" w:w="120"/>
+              <w:bottom w:type="dxa" w:w="80"/>
+              <w:right w:type="dxa" w:w="120"/>
+            </w:tcMar>
+          </w:tcPr>
+          <w:p>
+            <w:pPr>
+              <w:keepNext w:val="false"/>
             </w:pPr>
             <w:r>
               <w:rPr>
@@ -6585,7 +6974,7 @@
           </w:tcPr>
           <w:p>
             <w:pPr>
-              <w:keepNext/>
+              <w:keepNext w:val="false"/>
             </w:pPr>
             <w:r>
               <w:rPr>
@@ -6818,7 +7207,7 @@
           <w:sz w:val="22"/>
           <w:szCs w:val="22"/>
         </w:rPr>
-        <w:t xml:space="preserve">Push the code to GitHub and merge the </w:t>
+        <w:t xml:space="preserve">Push the code to GitHub, merge the </w:t>
       </w:r>
       <w:r>
         <w:rPr>
@@ -6852,7 +7241,7 @@
           <w:sz w:val="22"/>
           <w:szCs w:val="22"/>
         </w:rPr>
-        <w:t xml:space="preserve">.</w:t>
+        <w:t xml:space="preserve">, and publish the first release so update checks work.</w:t>
       </w:r>
     </w:p>
     <w:p>
@@ -6895,7 +7284,7 @@
         </w:numPr>
         <w:spacing w:after="60"/>
       </w:pPr>
-      <w:hyperlink w:history="1" r:id="rIdn90yjiayzfx1pm2yayyfw">
+      <w:hyperlink w:history="1" r:id="rIdnpubyfxvb0v0x_kddlsxz">
         <w:r>
           <w:rPr>
             <w:rStyle w:val="Hyperlink"/>
@@ -6927,7 +7316,7 @@
         </w:numPr>
         <w:spacing w:after="60"/>
       </w:pPr>
-      <w:hyperlink w:history="1" r:id="rIdn11_ukhqhqi1xbujnuz8c">
+      <w:hyperlink w:history="1" r:id="rId6gphpslgvxs1izjmdvzkn">
         <w:r>
           <w:rPr>
             <w:rStyle w:val="Hyperlink"/>
@@ -6959,7 +7348,7 @@
         </w:numPr>
         <w:spacing w:after="60"/>
       </w:pPr>
-      <w:hyperlink w:history="1" r:id="rIdrjdtmb8_snwd4sxsnt0th">
+      <w:hyperlink w:history="1" r:id="rId4leakg-cwixd6y3-dptb6">
         <w:r>
           <w:rPr>
             <w:rStyle w:val="Hyperlink"/>
@@ -6980,7 +7369,7 @@
         </w:rPr>
         <w:t xml:space="preserve"> and its </w:t>
       </w:r>
-      <w:hyperlink w:history="1" r:id="rIdxobp5ao6bscosdvx6uhpm">
+      <w:hyperlink w:history="1" r:id="rIdglmpb8p8mnba_xg4gdmuf">
         <w:r>
           <w:rPr>
             <w:rStyle w:val="Hyperlink"/>
@@ -7001,7 +7390,7 @@
         </w:rPr>
         <w:t xml:space="preserve">; price from </w:t>
       </w:r>
-      <w:hyperlink w:history="1" r:id="rIdzijcdte5tpkql3zmvs_ab">
+      <w:hyperlink w:history="1" r:id="rIdmnn0dapnz81i_ewgt6rsp">
         <w:r>
           <w:rPr>
             <w:rStyle w:val="Hyperlink"/>
@@ -7033,7 +7422,7 @@
         </w:numPr>
         <w:spacing w:after="60"/>
       </w:pPr>
-      <w:hyperlink w:history="1" r:id="rId-2fo3d5ofs1usmzjuxz2g">
+      <w:hyperlink w:history="1" r:id="rId-fd7bwim28xjr85xq2i4e">
         <w:r>
           <w:rPr>
             <w:rStyle w:val="Hyperlink"/>
@@ -7054,7 +7443,7 @@
         </w:rPr>
         <w:t xml:space="preserve"> and the </w:t>
       </w:r>
-      <w:hyperlink w:history="1" r:id="rIdtyk9yeqg-dwb471mfsphn">
+      <w:hyperlink w:history="1" r:id="rIdlwwxjmjcypygzqcsqdux2">
         <w:r>
           <w:rPr>
             <w:rStyle w:val="Hyperlink"/>
@@ -7078,7 +7467,7 @@
         </w:numPr>
         <w:spacing w:after="60"/>
       </w:pPr>
-      <w:hyperlink w:history="1" r:id="rIdagf5ifkpfa08gutopx9cc">
+      <w:hyperlink w:history="1" r:id="rIdqquc_ac_ecy90ij4aot8b">
         <w:r>
           <w:rPr>
             <w:rStyle w:val="Hyperlink"/>
@@ -7099,7 +7488,7 @@
         </w:rPr>
         <w:t xml:space="preserve"> and the </w:t>
       </w:r>
-      <w:hyperlink w:history="1" r:id="rIdgda0sa7s72dbkavq50a1w">
+      <w:hyperlink w:history="1" r:id="rId-_4xtrbohpja4qvtlht7m">
         <w:r>
           <w:rPr>
             <w:rStyle w:val="Hyperlink"/>
@@ -7123,7 +7512,7 @@
         </w:numPr>
         <w:spacing w:after="60"/>
       </w:pPr>
-      <w:hyperlink w:history="1" r:id="rIdpult9bh-kozc2pgsk0nxe">
+      <w:hyperlink w:history="1" r:id="rIdkm_twzxzefdccyid7cyxz">
         <w:r>
           <w:rPr>
             <w:rStyle w:val="Hyperlink"/>
@@ -7155,7 +7544,7 @@
         </w:numPr>
         <w:spacing w:after="60"/>
       </w:pPr>
-      <w:hyperlink w:history="1" r:id="rIdb9ftgmw7qoqfsye9zf8pq">
+      <w:hyperlink w:history="1" r:id="rId_1iubsopwywkp7porkzxu">
         <w:r>
           <w:rPr>
             <w:rStyle w:val="Hyperlink"/>

</xml_diff>

<commit_message>
Release 1.3.0: Find & recover
- Find a file: search organizer moves and saved folders by name, open or
  show in Explorer
- File versions: keep the last N (default 4) saved versions of files in
  protected folders; restore, save a copy, or bring back deleted files;
  versions follow files the organizer moves
- Recycle Bin: list and restore items to their original location,
  never overwriting
- tests never touch the real Recycle Bin
- docs: guide section, briefing and roadmap updated

Co-Authored-By: Claude Opus 5.5 <noreply@anthropic.com>
</commit_message>
<xml_diff>
--- a/docs/briefing.docx
+++ b/docs/briefing.docx
@@ -46,7 +46,7 @@
           <w:sz w:val="22"/>
           <w:szCs w:val="22"/>
         </w:rPr>
-        <w:t xml:space="preserve">Desktop Organizer 1.2.0 is built, tested and packaged for Windows, but not yet published or sold. It sorts files in the Desktop, Downloads, Documents or any chosen folder into a folder structure the user picks, and every run can be undone.</w:t>
+        <w:t xml:space="preserve">Desktop Organizer 1.3.0 is built, tested and packaged for Windows, but not yet published or sold. It sorts files in the Desktop, Downloads, Documents or any chosen folder into a folder structure the user picks, and every run can be undone.</w:t>
       </w:r>
     </w:p>
     <w:p>
@@ -75,7 +75,7 @@
           <w:sz w:val="22"/>
           <w:szCs w:val="22"/>
         </w:rPr>
-        <w:t xml:space="preserve"> a Windows app with an installer and portable zip, 106 automated tests, and three tagged releases (1.0.0, 1.1.0 and 1.2.0, all on 5 October 2026).</w:t>
+        <w:t xml:space="preserve"> a Windows app with an installer and portable zip, 127 automated tests, and four tagged releases (1.0.0 to 1.3.0, all on 5 October 2026).</w:t>
       </w:r>
     </w:p>
     <w:p>
@@ -155,7 +155,7 @@
           <w:sz w:val="22"/>
           <w:szCs w:val="22"/>
         </w:rPr>
-        <w:t xml:space="preserve">The app grew from a 107-line script into a full desktop app in three releases. Every feature below is working and free today.</w:t>
+        <w:t xml:space="preserve">The app grew from a 107-line script into a full desktop app in four releases. Every feature below is working and free today.</w:t>
       </w:r>
     </w:p>
     <w:tbl>
@@ -1704,6 +1704,309 @@
           </w:p>
         </w:tc>
       </w:tr>
+      <w:tr>
+        <w:trPr>
+          <w:cantSplit/>
+        </w:trPr>
+        <w:tc>
+          <w:tcPr>
+            <w:tcW w:type="dxa" w:w="2059"/>
+            <w:tcBorders>
+              <w:top w:val="single" w:color="D0D5DD" w:sz="4"/>
+              <w:left w:val="single" w:color="D0D5DD" w:sz="4"/>
+              <w:bottom w:val="single" w:color="D0D5DD" w:sz="4"/>
+              <w:right w:val="single" w:color="D0D5DD" w:sz="4"/>
+            </w:tcBorders>
+            <w:tcMar>
+              <w:top w:type="dxa" w:w="80"/>
+              <w:left w:type="dxa" w:w="120"/>
+              <w:bottom w:type="dxa" w:w="80"/>
+              <w:right w:type="dxa" w:w="120"/>
+            </w:tcMar>
+          </w:tcPr>
+          <w:p>
+            <w:pPr>
+              <w:keepNext w:val="false"/>
+            </w:pPr>
+            <w:r>
+              <w:rPr>
+                <w:rFonts w:ascii="Calibri" w:cs="Calibri" w:eastAsia="Calibri" w:hAnsi="Calibri"/>
+                <w:b w:val="false"/>
+                <w:bCs w:val="false"/>
+                <w:sz w:val="20"/>
+                <w:szCs w:val="20"/>
+              </w:rPr>
+              <w:t xml:space="preserve">Find a file</w:t>
+            </w:r>
+          </w:p>
+        </w:tc>
+        <w:tc>
+          <w:tcPr>
+            <w:tcW w:type="dxa" w:w="5897"/>
+            <w:tcBorders>
+              <w:top w:val="single" w:color="D0D5DD" w:sz="4"/>
+              <w:left w:val="single" w:color="D0D5DD" w:sz="4"/>
+              <w:bottom w:val="single" w:color="D0D5DD" w:sz="4"/>
+              <w:right w:val="single" w:color="D0D5DD" w:sz="4"/>
+            </w:tcBorders>
+            <w:tcMar>
+              <w:top w:type="dxa" w:w="80"/>
+              <w:left w:type="dxa" w:w="120"/>
+              <w:bottom w:type="dxa" w:w="80"/>
+              <w:right w:type="dxa" w:w="120"/>
+            </w:tcMar>
+          </w:tcPr>
+          <w:p>
+            <w:pPr>
+              <w:keepNext w:val="false"/>
+            </w:pPr>
+            <w:r>
+              <w:rPr>
+                <w:rFonts w:ascii="Calibri" w:cs="Calibri" w:eastAsia="Calibri" w:hAnsi="Calibri"/>
+                <w:b w:val="false"/>
+                <w:bCs w:val="false"/>
+                <w:sz w:val="20"/>
+                <w:szCs w:val="20"/>
+              </w:rPr>
+              <w:t xml:space="preserve">Search by name to see where the organizer moved a file, from where and when</w:t>
+            </w:r>
+          </w:p>
+        </w:tc>
+        <w:tc>
+          <w:tcPr>
+            <w:tcW w:type="dxa" w:w="1404"/>
+            <w:tcBorders>
+              <w:top w:val="single" w:color="D0D5DD" w:sz="4"/>
+              <w:left w:val="single" w:color="D0D5DD" w:sz="4"/>
+              <w:bottom w:val="single" w:color="D0D5DD" w:sz="4"/>
+              <w:right w:val="single" w:color="D0D5DD" w:sz="4"/>
+            </w:tcBorders>
+            <w:tcMar>
+              <w:top w:type="dxa" w:w="80"/>
+              <w:left w:type="dxa" w:w="120"/>
+              <w:bottom w:type="dxa" w:w="80"/>
+              <w:right w:type="dxa" w:w="120"/>
+            </w:tcMar>
+          </w:tcPr>
+          <w:p>
+            <w:pPr>
+              <w:keepNext w:val="false"/>
+            </w:pPr>
+            <w:r>
+              <w:rPr>
+                <w:rFonts w:ascii="Calibri" w:cs="Calibri" w:eastAsia="Calibri" w:hAnsi="Calibri"/>
+                <w:b w:val="false"/>
+                <w:bCs w:val="false"/>
+                <w:sz w:val="20"/>
+                <w:szCs w:val="20"/>
+              </w:rPr>
+              <w:t xml:space="preserve">1.3</w:t>
+            </w:r>
+          </w:p>
+        </w:tc>
+      </w:tr>
+      <w:tr>
+        <w:trPr>
+          <w:cantSplit/>
+        </w:trPr>
+        <w:tc>
+          <w:tcPr>
+            <w:tcW w:type="dxa" w:w="2059"/>
+            <w:tcBorders>
+              <w:top w:val="single" w:color="D0D5DD" w:sz="4"/>
+              <w:left w:val="single" w:color="D0D5DD" w:sz="4"/>
+              <w:bottom w:val="single" w:color="D0D5DD" w:sz="4"/>
+              <w:right w:val="single" w:color="D0D5DD" w:sz="4"/>
+            </w:tcBorders>
+            <w:tcMar>
+              <w:top w:type="dxa" w:w="80"/>
+              <w:left w:type="dxa" w:w="120"/>
+              <w:bottom w:type="dxa" w:w="80"/>
+              <w:right w:type="dxa" w:w="120"/>
+            </w:tcMar>
+          </w:tcPr>
+          <w:p>
+            <w:pPr>
+              <w:keepNext w:val="false"/>
+            </w:pPr>
+            <w:r>
+              <w:rPr>
+                <w:rFonts w:ascii="Calibri" w:cs="Calibri" w:eastAsia="Calibri" w:hAnsi="Calibri"/>
+                <w:b w:val="false"/>
+                <w:bCs w:val="false"/>
+                <w:sz w:val="20"/>
+                <w:szCs w:val="20"/>
+              </w:rPr>
+              <w:t xml:space="preserve">File versions</w:t>
+            </w:r>
+          </w:p>
+        </w:tc>
+        <w:tc>
+          <w:tcPr>
+            <w:tcW w:type="dxa" w:w="5897"/>
+            <w:tcBorders>
+              <w:top w:val="single" w:color="D0D5DD" w:sz="4"/>
+              <w:left w:val="single" w:color="D0D5DD" w:sz="4"/>
+              <w:bottom w:val="single" w:color="D0D5DD" w:sz="4"/>
+              <w:right w:val="single" w:color="D0D5DD" w:sz="4"/>
+            </w:tcBorders>
+            <w:tcMar>
+              <w:top w:type="dxa" w:w="80"/>
+              <w:left w:type="dxa" w:w="120"/>
+              <w:bottom w:type="dxa" w:w="80"/>
+              <w:right w:type="dxa" w:w="120"/>
+            </w:tcMar>
+          </w:tcPr>
+          <w:p>
+            <w:pPr>
+              <w:keepNext w:val="false"/>
+            </w:pPr>
+            <w:r>
+              <w:rPr>
+                <w:rFonts w:ascii="Calibri" w:cs="Calibri" w:eastAsia="Calibri" w:hAnsi="Calibri"/>
+                <w:b w:val="false"/>
+                <w:bCs w:val="false"/>
+                <w:sz w:val="20"/>
+                <w:szCs w:val="20"/>
+              </w:rPr>
+              <w:t xml:space="preserve">Keeps the last 4 saved versions of files in protected folders; restore any, or bring back deleted files</w:t>
+            </w:r>
+          </w:p>
+        </w:tc>
+        <w:tc>
+          <w:tcPr>
+            <w:tcW w:type="dxa" w:w="1404"/>
+            <w:tcBorders>
+              <w:top w:val="single" w:color="D0D5DD" w:sz="4"/>
+              <w:left w:val="single" w:color="D0D5DD" w:sz="4"/>
+              <w:bottom w:val="single" w:color="D0D5DD" w:sz="4"/>
+              <w:right w:val="single" w:color="D0D5DD" w:sz="4"/>
+            </w:tcBorders>
+            <w:tcMar>
+              <w:top w:type="dxa" w:w="80"/>
+              <w:left w:type="dxa" w:w="120"/>
+              <w:bottom w:type="dxa" w:w="80"/>
+              <w:right w:type="dxa" w:w="120"/>
+            </w:tcMar>
+          </w:tcPr>
+          <w:p>
+            <w:pPr>
+              <w:keepNext w:val="false"/>
+            </w:pPr>
+            <w:r>
+              <w:rPr>
+                <w:rFonts w:ascii="Calibri" w:cs="Calibri" w:eastAsia="Calibri" w:hAnsi="Calibri"/>
+                <w:b w:val="false"/>
+                <w:bCs w:val="false"/>
+                <w:sz w:val="20"/>
+                <w:szCs w:val="20"/>
+              </w:rPr>
+              <w:t xml:space="preserve">1.3</w:t>
+            </w:r>
+          </w:p>
+        </w:tc>
+      </w:tr>
+      <w:tr>
+        <w:trPr>
+          <w:cantSplit/>
+        </w:trPr>
+        <w:tc>
+          <w:tcPr>
+            <w:tcW w:type="dxa" w:w="2059"/>
+            <w:tcBorders>
+              <w:top w:val="single" w:color="D0D5DD" w:sz="4"/>
+              <w:left w:val="single" w:color="D0D5DD" w:sz="4"/>
+              <w:bottom w:val="single" w:color="D0D5DD" w:sz="4"/>
+              <w:right w:val="single" w:color="D0D5DD" w:sz="4"/>
+            </w:tcBorders>
+            <w:tcMar>
+              <w:top w:type="dxa" w:w="80"/>
+              <w:left w:type="dxa" w:w="120"/>
+              <w:bottom w:type="dxa" w:w="80"/>
+              <w:right w:type="dxa" w:w="120"/>
+            </w:tcMar>
+          </w:tcPr>
+          <w:p>
+            <w:pPr>
+              <w:keepNext w:val="false"/>
+            </w:pPr>
+            <w:r>
+              <w:rPr>
+                <w:rFonts w:ascii="Calibri" w:cs="Calibri" w:eastAsia="Calibri" w:hAnsi="Calibri"/>
+                <w:b w:val="false"/>
+                <w:bCs w:val="false"/>
+                <w:sz w:val="20"/>
+                <w:szCs w:val="20"/>
+              </w:rPr>
+              <w:t xml:space="preserve">Recycle Bin recovery</w:t>
+            </w:r>
+          </w:p>
+        </w:tc>
+        <w:tc>
+          <w:tcPr>
+            <w:tcW w:type="dxa" w:w="5897"/>
+            <w:tcBorders>
+              <w:top w:val="single" w:color="D0D5DD" w:sz="4"/>
+              <w:left w:val="single" w:color="D0D5DD" w:sz="4"/>
+              <w:bottom w:val="single" w:color="D0D5DD" w:sz="4"/>
+              <w:right w:val="single" w:color="D0D5DD" w:sz="4"/>
+            </w:tcBorders>
+            <w:tcMar>
+              <w:top w:type="dxa" w:w="80"/>
+              <w:left w:type="dxa" w:w="120"/>
+              <w:bottom w:type="dxa" w:w="80"/>
+              <w:right w:type="dxa" w:w="120"/>
+            </w:tcMar>
+          </w:tcPr>
+          <w:p>
+            <w:pPr>
+              <w:keepNext w:val="false"/>
+            </w:pPr>
+            <w:r>
+              <w:rPr>
+                <w:rFonts w:ascii="Calibri" w:cs="Calibri" w:eastAsia="Calibri" w:hAnsi="Calibri"/>
+                <w:b w:val="false"/>
+                <w:bCs w:val="false"/>
+                <w:sz w:val="20"/>
+                <w:szCs w:val="20"/>
+              </w:rPr>
+              <w:t xml:space="preserve">Lists deleted items with their original location and puts them back</w:t>
+            </w:r>
+          </w:p>
+        </w:tc>
+        <w:tc>
+          <w:tcPr>
+            <w:tcW w:type="dxa" w:w="1404"/>
+            <w:tcBorders>
+              <w:top w:val="single" w:color="D0D5DD" w:sz="4"/>
+              <w:left w:val="single" w:color="D0D5DD" w:sz="4"/>
+              <w:bottom w:val="single" w:color="D0D5DD" w:sz="4"/>
+              <w:right w:val="single" w:color="D0D5DD" w:sz="4"/>
+            </w:tcBorders>
+            <w:tcMar>
+              <w:top w:type="dxa" w:w="80"/>
+              <w:left w:type="dxa" w:w="120"/>
+              <w:bottom w:type="dxa" w:w="80"/>
+              <w:right w:type="dxa" w:w="120"/>
+            </w:tcMar>
+          </w:tcPr>
+          <w:p>
+            <w:pPr>
+              <w:keepNext w:val="false"/>
+            </w:pPr>
+            <w:r>
+              <w:rPr>
+                <w:rFonts w:ascii="Calibri" w:cs="Calibri" w:eastAsia="Calibri" w:hAnsi="Calibri"/>
+                <w:b w:val="false"/>
+                <w:bCs w:val="false"/>
+                <w:sz w:val="20"/>
+                <w:szCs w:val="20"/>
+              </w:rPr>
+              <w:t xml:space="preserve">1.3</w:t>
+            </w:r>
+          </w:p>
+        </w:tc>
+      </w:tr>
     </w:tbl>
     <w:p>
       <w:pPr>
@@ -2433,7 +2736,7 @@
                 <w:sz w:val="20"/>
                 <w:szCs w:val="20"/>
               </w:rPr>
-              <w:t xml:space="preserve">106 automated tests, including headless tests of the window</w:t>
+              <w:t xml:space="preserve">127 automated tests, including headless tests of the window</w:t>
             </w:r>
           </w:p>
         </w:tc>
@@ -2465,7 +2768,7 @@
                 <w:sz w:val="20"/>
                 <w:szCs w:val="20"/>
               </w:rPr>
-              <w:t xml:space="preserve">Tests use fake Desktop and Downloads folders, never the real ones</w:t>
+              <w:t xml:space="preserve">Tests use fake Desktop, Downloads and Recycle Bin folders, never the real ones</w:t>
             </w:r>
           </w:p>
         </w:tc>
@@ -2521,7 +2824,7 @@
           <w:sz w:val="22"/>
           <w:szCs w:val="22"/>
         </w:rPr>
-        <w:t xml:space="preserve">, </w:t>
+        <w:t xml:space="preserve"> to </w:t>
       </w:r>
       <w:r>
         <w:rPr>
@@ -2530,24 +2833,7 @@
           <w:szCs w:val="19"/>
           <w:shd w:fill="F2F4F7" w:color="auto" w:val="clear"/>
         </w:rPr>
-        <w:t xml:space="preserve">v1.1.0</w:t>
-      </w:r>
-      <w:r>
-        <w:rPr>
-          <w:rFonts w:ascii="Calibri" w:cs="Calibri" w:eastAsia="Calibri" w:hAnsi="Calibri"/>
-          <w:sz w:val="22"/>
-          <w:szCs w:val="22"/>
-        </w:rPr>
-        <w:t xml:space="preserve"> and </w:t>
-      </w:r>
-      <w:r>
-        <w:rPr>
-          <w:rFonts w:ascii="Consolas" w:cs="Consolas" w:eastAsia="Consolas" w:hAnsi="Consolas"/>
-          <w:sz w:val="19"/>
-          <w:szCs w:val="19"/>
-          <w:shd w:fill="F2F4F7" w:color="auto" w:val="clear"/>
-        </w:rPr>
-        <w:t xml:space="preserve">v1.2.0</w:t>
+        <w:t xml:space="preserve">v1.3.0</w:t>
       </w:r>
       <w:r>
         <w:rPr>
@@ -2749,6 +3035,75 @@
                 <w:szCs w:val="20"/>
               </w:rPr>
               <w:t xml:space="preserve">Any folder (Downloads, Documents, drives)</w:t>
+            </w:r>
+          </w:p>
+        </w:tc>
+      </w:tr>
+      <w:tr>
+        <w:trPr>
+          <w:cantSplit/>
+        </w:trPr>
+        <w:tc>
+          <w:tcPr>
+            <w:tcW w:type="dxa" w:w="4680"/>
+            <w:tcBorders>
+              <w:top w:val="single" w:color="D0D5DD" w:sz="4"/>
+              <w:left w:val="single" w:color="D0D5DD" w:sz="4"/>
+              <w:bottom w:val="single" w:color="D0D5DD" w:sz="4"/>
+              <w:right w:val="single" w:color="D0D5DD" w:sz="4"/>
+            </w:tcBorders>
+            <w:tcMar>
+              <w:top w:type="dxa" w:w="80"/>
+              <w:left w:type="dxa" w:w="120"/>
+              <w:bottom w:type="dxa" w:w="80"/>
+              <w:right w:type="dxa" w:w="120"/>
+            </w:tcMar>
+          </w:tcPr>
+          <w:p>
+            <w:pPr>
+              <w:keepNext/>
+            </w:pPr>
+            <w:r>
+              <w:rPr>
+                <w:rFonts w:ascii="Calibri" w:cs="Calibri" w:eastAsia="Calibri" w:hAnsi="Calibri"/>
+                <w:b w:val="false"/>
+                <w:bCs w:val="false"/>
+                <w:sz w:val="20"/>
+                <w:szCs w:val="20"/>
+              </w:rPr>
+              <w:t xml:space="preserve">Find a file; restore from the Recycle Bin</w:t>
+            </w:r>
+          </w:p>
+        </w:tc>
+        <w:tc>
+          <w:tcPr>
+            <w:tcW w:type="dxa" w:w="4680"/>
+            <w:tcBorders>
+              <w:top w:val="single" w:color="D0D5DD" w:sz="4"/>
+              <w:left w:val="single" w:color="D0D5DD" w:sz="4"/>
+              <w:bottom w:val="single" w:color="D0D5DD" w:sz="4"/>
+              <w:right w:val="single" w:color="D0D5DD" w:sz="4"/>
+            </w:tcBorders>
+            <w:tcMar>
+              <w:top w:type="dxa" w:w="80"/>
+              <w:left w:type="dxa" w:w="120"/>
+              <w:bottom w:type="dxa" w:w="80"/>
+              <w:right w:type="dxa" w:w="120"/>
+            </w:tcMar>
+          </w:tcPr>
+          <w:p>
+            <w:pPr>
+              <w:keepNext/>
+            </w:pPr>
+            <w:r>
+              <w:rPr>
+                <w:rFonts w:ascii="Calibri" w:cs="Calibri" w:eastAsia="Calibri" w:hAnsi="Calibri"/>
+                <w:b w:val="false"/>
+                <w:bCs w:val="false"/>
+                <w:sz w:val="20"/>
+                <w:szCs w:val="20"/>
+              </w:rPr>
+              <w:t xml:space="preserve">File versions (last 4 saves of protected files)</w:t>
             </w:r>
           </w:p>
         </w:tc>
@@ -5385,7 +5740,7 @@
           <w:sz w:val="22"/>
           <w:szCs w:val="22"/>
         </w:rPr>
-        <w:t xml:space="preserve">. Most of that already exists in 1.2; the rest is a short list of additions.</w:t>
+        <w:t xml:space="preserve">. Most of that already exists in 1.3; the rest is a short list of additions.</w:t>
       </w:r>
     </w:p>
     <w:tbl>
@@ -5642,6 +5997,107 @@
                 <w:sz w:val="20"/>
                 <w:szCs w:val="20"/>
               </w:rPr>
+              <w:t xml:space="preserve">Recovery built in</w:t>
+            </w:r>
+          </w:p>
+        </w:tc>
+        <w:tc>
+          <w:tcPr>
+            <w:tcW w:type="dxa" w:w="3557"/>
+            <w:tcBorders>
+              <w:top w:val="single" w:color="D0D5DD" w:sz="4"/>
+              <w:left w:val="single" w:color="D0D5DD" w:sz="4"/>
+              <w:bottom w:val="single" w:color="D0D5DD" w:sz="4"/>
+              <w:right w:val="single" w:color="D0D5DD" w:sz="4"/>
+            </w:tcBorders>
+            <w:tcMar>
+              <w:top w:type="dxa" w:w="80"/>
+              <w:left w:type="dxa" w:w="120"/>
+              <w:bottom w:type="dxa" w:w="80"/>
+              <w:right w:type="dxa" w:w="120"/>
+            </w:tcMar>
+          </w:tcPr>
+          <w:p>
+            <w:pPr>
+              <w:keepNext w:val="false"/>
+            </w:pPr>
+            <w:r>
+              <w:rPr>
+                <w:rFonts w:ascii="Calibri" w:cs="Calibri" w:eastAsia="Calibri" w:hAnsi="Calibri"/>
+                <w:b w:val="false"/>
+                <w:bCs w:val="false"/>
+                <w:sz w:val="20"/>
+                <w:szCs w:val="20"/>
+              </w:rPr>
+              <w:t xml:space="preserve">Find where any file went, restore the last 4 versions of protected files, and bring back Recycle Bin items in one window. None of the tools above combine organizing with recovery</w:t>
+            </w:r>
+          </w:p>
+        </w:tc>
+        <w:tc>
+          <w:tcPr>
+            <w:tcW w:type="dxa" w:w="2995"/>
+            <w:tcBorders>
+              <w:top w:val="single" w:color="D0D5DD" w:sz="4"/>
+              <w:left w:val="single" w:color="D0D5DD" w:sz="4"/>
+              <w:bottom w:val="single" w:color="D0D5DD" w:sz="4"/>
+              <w:right w:val="single" w:color="D0D5DD" w:sz="4"/>
+            </w:tcBorders>
+            <w:tcMar>
+              <w:top w:type="dxa" w:w="80"/>
+              <w:left w:type="dxa" w:w="120"/>
+              <w:bottom w:type="dxa" w:w="80"/>
+              <w:right w:type="dxa" w:w="120"/>
+            </w:tcMar>
+          </w:tcPr>
+          <w:p>
+            <w:pPr>
+              <w:keepNext w:val="false"/>
+            </w:pPr>
+            <w:r>
+              <w:rPr>
+                <w:rFonts w:ascii="Calibri" w:cs="Calibri" w:eastAsia="Calibri" w:hAnsi="Calibri"/>
+                <w:b w:val="false"/>
+                <w:bCs w:val="false"/>
+                <w:sz w:val="20"/>
+                <w:szCs w:val="20"/>
+              </w:rPr>
+              <w:t xml:space="preserve">Built</w:t>
+            </w:r>
+          </w:p>
+        </w:tc>
+      </w:tr>
+      <w:tr>
+        <w:trPr>
+          <w:cantSplit/>
+        </w:trPr>
+        <w:tc>
+          <w:tcPr>
+            <w:tcW w:type="dxa" w:w="2808"/>
+            <w:tcBorders>
+              <w:top w:val="single" w:color="D0D5DD" w:sz="4"/>
+              <w:left w:val="single" w:color="D0D5DD" w:sz="4"/>
+              <w:bottom w:val="single" w:color="D0D5DD" w:sz="4"/>
+              <w:right w:val="single" w:color="D0D5DD" w:sz="4"/>
+            </w:tcBorders>
+            <w:tcMar>
+              <w:top w:type="dxa" w:w="80"/>
+              <w:left w:type="dxa" w:w="120"/>
+              <w:bottom w:type="dxa" w:w="80"/>
+              <w:right w:type="dxa" w:w="120"/>
+            </w:tcMar>
+          </w:tcPr>
+          <w:p>
+            <w:pPr>
+              <w:keepNext w:val="false"/>
+            </w:pPr>
+            <w:r>
+              <w:rPr>
+                <w:rFonts w:ascii="Calibri" w:cs="Calibri" w:eastAsia="Calibri" w:hAnsi="Calibri"/>
+                <w:b w:val="false"/>
+                <w:bCs w:val="false"/>
+                <w:sz w:val="20"/>
+                <w:szCs w:val="20"/>
+              </w:rPr>
               <w:t xml:space="preserve">See every destination first</w:t>
             </w:r>
           </w:p>
@@ -6387,7 +6843,7 @@
           <w:sz w:val="22"/>
           <w:szCs w:val="22"/>
         </w:rPr>
-        <w:t xml:space="preserve">Three releases are done; licensing (1.3) is next and waits on the pricing decisions below. No dates are set yet.</w:t>
+        <w:t xml:space="preserve">Four releases are done; licensing (1.4) is next and waits on the pricing decisions below. No dates are set yet.</w:t>
       </w:r>
     </w:p>
     <w:p>
@@ -6398,9 +6854,9 @@
       <w:r>
         <w:drawing>
           <wp:inline distT="0" distB="0" distL="0" distR="0">
-            <wp:extent cx="5943600" cy="4943475"/>
+            <wp:extent cx="5943600" cy="5572125"/>
             <wp:effectExtent t="0" r="0" b="0" l="0"/>
-            <wp:docPr id="2" name="roadmap" descr="Roadmap: 6 releases and 2 gates, not to scale" title="Roadmap: 6 releases and 2 gates, not to scale"/>
+            <wp:docPr id="2" name="roadmap" descr="Roadmap: 7 releases and 2 gates, not to scale" title="Roadmap: 7 releases and 2 gates, not to scale"/>
             <wp:cNvGraphicFramePr>
               <a:graphicFrameLocks xmlns:a="http://schemas.openxmlformats.org/drawingml/2006/main" noChangeAspect="1"/>
             </wp:cNvGraphicFramePr>
@@ -6423,7 +6879,7 @@
                   <pic:spPr bwMode="auto">
                     <a:xfrm>
                       <a:off x="0" y="0"/>
-                      <a:ext cx="5943600" cy="4943475"/>
+                      <a:ext cx="5943600" cy="5572125"/>
                     </a:xfrm>
                     <a:prstGeom prst="rect">
                       <a:avLst/>
@@ -6449,7 +6905,7 @@
           <w:sz w:val="18"/>
           <w:szCs w:val="18"/>
         </w:rPr>
-        <w:t xml:space="preserve">Roadmap: 6 releases and 2 gates, not to scale</w:t>
+        <w:t xml:space="preserve">Roadmap: 7 releases and 2 gates, not to scale</w:t>
       </w:r>
     </w:p>
     <w:p>
@@ -7284,7 +7740,7 @@
         </w:numPr>
         <w:spacing w:after="60"/>
       </w:pPr>
-      <w:hyperlink w:history="1" r:id="rIdnpubyfxvb0v0x_kddlsxz">
+      <w:hyperlink w:history="1" r:id="rIdo5ptvhi9uz8ddbmlesmav">
         <w:r>
           <w:rPr>
             <w:rStyle w:val="Hyperlink"/>
@@ -7316,7 +7772,7 @@
         </w:numPr>
         <w:spacing w:after="60"/>
       </w:pPr>
-      <w:hyperlink w:history="1" r:id="rId6gphpslgvxs1izjmdvzkn">
+      <w:hyperlink w:history="1" r:id="rIdofst0ofrvtevq3b9p0dcl">
         <w:r>
           <w:rPr>
             <w:rStyle w:val="Hyperlink"/>
@@ -7348,7 +7804,7 @@
         </w:numPr>
         <w:spacing w:after="60"/>
       </w:pPr>
-      <w:hyperlink w:history="1" r:id="rId4leakg-cwixd6y3-dptb6">
+      <w:hyperlink w:history="1" r:id="rIdvxaslctqhxrbrugiipt43">
         <w:r>
           <w:rPr>
             <w:rStyle w:val="Hyperlink"/>
@@ -7369,7 +7825,7 @@
         </w:rPr>
         <w:t xml:space="preserve"> and its </w:t>
       </w:r>
-      <w:hyperlink w:history="1" r:id="rIdglmpb8p8mnba_xg4gdmuf">
+      <w:hyperlink w:history="1" r:id="rId3-rlkwpe5yrlgmyhkoxbk">
         <w:r>
           <w:rPr>
             <w:rStyle w:val="Hyperlink"/>
@@ -7390,7 +7846,7 @@
         </w:rPr>
         <w:t xml:space="preserve">; price from </w:t>
       </w:r>
-      <w:hyperlink w:history="1" r:id="rIdmnn0dapnz81i_ewgt6rsp">
+      <w:hyperlink w:history="1" r:id="rIdc3bccwyh0ymhqhbu9legv">
         <w:r>
           <w:rPr>
             <w:rStyle w:val="Hyperlink"/>
@@ -7422,7 +7878,7 @@
         </w:numPr>
         <w:spacing w:after="60"/>
       </w:pPr>
-      <w:hyperlink w:history="1" r:id="rId-fd7bwim28xjr85xq2i4e">
+      <w:hyperlink w:history="1" r:id="rIdxpgi7wzwo6nqqcojtarc5">
         <w:r>
           <w:rPr>
             <w:rStyle w:val="Hyperlink"/>
@@ -7443,7 +7899,7 @@
         </w:rPr>
         <w:t xml:space="preserve"> and the </w:t>
       </w:r>
-      <w:hyperlink w:history="1" r:id="rIdlwwxjmjcypygzqcsqdux2">
+      <w:hyperlink w:history="1" r:id="rIdytq5hkx5lvxs-pqovxlv2">
         <w:r>
           <w:rPr>
             <w:rStyle w:val="Hyperlink"/>
@@ -7467,7 +7923,7 @@
         </w:numPr>
         <w:spacing w:after="60"/>
       </w:pPr>
-      <w:hyperlink w:history="1" r:id="rIdqquc_ac_ecy90ij4aot8b">
+      <w:hyperlink w:history="1" r:id="rIdkqod_jfisx28ikksehw4k">
         <w:r>
           <w:rPr>
             <w:rStyle w:val="Hyperlink"/>
@@ -7488,7 +7944,7 @@
         </w:rPr>
         <w:t xml:space="preserve"> and the </w:t>
       </w:r>
-      <w:hyperlink w:history="1" r:id="rId-_4xtrbohpja4qvtlht7m">
+      <w:hyperlink w:history="1" r:id="rIdx0qev8np8_ed18mzxppbq">
         <w:r>
           <w:rPr>
             <w:rStyle w:val="Hyperlink"/>
@@ -7512,7 +7968,7 @@
         </w:numPr>
         <w:spacing w:after="60"/>
       </w:pPr>
-      <w:hyperlink w:history="1" r:id="rIdkm_twzxzefdccyid7cyxz">
+      <w:hyperlink w:history="1" r:id="rIdahh1shi0mxjwpsvocsxyl">
         <w:r>
           <w:rPr>
             <w:rStyle w:val="Hyperlink"/>
@@ -7544,7 +8000,7 @@
         </w:numPr>
         <w:spacing w:after="60"/>
       </w:pPr>
-      <w:hyperlink w:history="1" r:id="rId_1iubsopwywkp7porkzxu">
+      <w:hyperlink w:history="1" r:id="rIdedf5ffz-m2sh2hex0bse0">
         <w:r>
           <w:rPr>
             <w:rStyle w:val="Hyperlink"/>

</xml_diff>